<commit_message>
commit on 30 spet
</commit_message>
<xml_diff>
--- a/javascript assignment/assignment questions/control statements/switch_case_assignment.docx
+++ b/javascript assignment/assignment questions/control statements/switch_case_assignment.docx
@@ -13,7 +13,10 @@
           <w:lang w:val="en-US"/>
         </w:rPr>
       </w:pPr>
-      <w:r>
+    </w:p>
+    <w:p>
+      <w:pPr>
+        <w:jc w:val="center"/>
         <w:rPr>
           <w:b/>
           <w:sz w:val="48"/>
@@ -21,9 +24,9 @@
           <w:u w:val="single"/>
           <w:lang w:val="en-US"/>
         </w:rPr>
-        <w:t xml:space="preserve">Switch Case </w:t>
-      </w:r>
-      <w:proofErr w:type="gramStart"/>
+      </w:pPr>
+      <w:bookmarkStart w:id="0" w:name="_GoBack"/>
+      <w:bookmarkEnd w:id="0"/>
       <w:r>
         <w:rPr>
           <w:b/>
@@ -32,9 +35,8 @@
           <w:u w:val="single"/>
           <w:lang w:val="en-US"/>
         </w:rPr>
-        <w:t>Assignment :</w:t>
-      </w:r>
-      <w:proofErr w:type="gramEnd"/>
+        <w:t>Switch Case Assignment :</w:t>
+      </w:r>
     </w:p>
     <w:p>
       <w:pPr>
@@ -496,15 +498,7 @@
       </w:r>
       <w:r>
         <w:br/>
-        <w:t xml:space="preserve">Take the </w:t>
-      </w:r>
-      <w:proofErr w:type="spellStart"/>
-      <w:r>
-        <w:t>color</w:t>
-      </w:r>
-      <w:proofErr w:type="spellEnd"/>
-      <w:r>
-        <w:t xml:space="preserve"> of a traffic signal as input (</w:t>
+        <w:t>Take the color of a traffic signal as input (</w:t>
       </w:r>
       <w:r>
         <w:rPr>
@@ -1086,7 +1080,6 @@
         <w:pStyle w:val="NormalWeb"/>
         <w:ind w:left="720"/>
       </w:pPr>
-      <w:bookmarkStart w:id="0" w:name="_GoBack"/>
       <w:r>
         <w:rPr>
           <w:rStyle w:val="Strong"/>
@@ -1103,9 +1096,6 @@
       </w:r>
       <w:r>
         <w:br/>
-      </w:r>
-      <w:bookmarkEnd w:id="0"/>
-      <w:r>
         <w:t xml:space="preserve">Use </w:t>
       </w:r>
       <w:r>
@@ -2200,6 +2190,7 @@
   <w:style w:type="character" w:default="1" w:styleId="DefaultParagraphFont">
     <w:name w:val="Default Paragraph Font"/>
     <w:uiPriority w:val="1"/>
+    <w:semiHidden/>
     <w:unhideWhenUsed/>
   </w:style>
   <w:style w:type="table" w:default="1" w:styleId="TableNormal">

</xml_diff>